<commit_message>
feat: add anamnesis Q&A table to bienestar report template
Co-authored-by: Cursor <cursoragent@cursor.com>
</commit_message>
<xml_diff>
--- a/src/assets/report/relatorio_bienestar_1.docx
+++ b/src/assets/report/relatorio_bienestar_1.docx
@@ -210,7 +210,23 @@
           <w:rFonts w:asciiTheme="majorHAnsi" w:eastAsia="Calibri" w:hAnsiTheme="majorHAnsi" w:cstheme="majorHAnsi"/>
           <w:lang w:val="pt-BR"/>
         </w:rPr>
-        <w:t>, mas auxilia na identificação de tendências de sobrecarga ou equilíbrio no seus sistemas.</w:t>
+        <w:t xml:space="preserve">, mas auxilia na identificação de tendências de sobrecarga ou equilíbrio </w:t>
+      </w:r>
+      <w:proofErr w:type="gramStart"/>
+      <w:r>
+        <w:rPr>
+          <w:rFonts w:asciiTheme="majorHAnsi" w:eastAsia="Calibri" w:hAnsiTheme="majorHAnsi" w:cstheme="majorHAnsi"/>
+          <w:lang w:val="pt-BR"/>
+        </w:rPr>
+        <w:t>no seus sistemas</w:t>
+      </w:r>
+      <w:proofErr w:type="gramEnd"/>
+      <w:r>
+        <w:rPr>
+          <w:rFonts w:asciiTheme="majorHAnsi" w:eastAsia="Calibri" w:hAnsiTheme="majorHAnsi" w:cstheme="majorHAnsi"/>
+          <w:lang w:val="pt-BR"/>
+        </w:rPr>
+        <w:t>.</w:t>
       </w:r>
     </w:p>
     <w:p>
@@ -1486,7 +1502,23 @@
                 <w:rFonts w:asciiTheme="majorHAnsi" w:eastAsia="Calibri" w:hAnsiTheme="majorHAnsi" w:cstheme="majorHAnsi"/>
                 <w:lang w:val="pt-BR"/>
               </w:rPr>
-              <w:t>Ressonância emocional aguda no momento atual.</w:t>
+              <w:t xml:space="preserve">Ressonância emocional aguda </w:t>
+            </w:r>
+            <w:proofErr w:type="gramStart"/>
+            <w:r>
+              <w:rPr>
+                <w:rFonts w:asciiTheme="majorHAnsi" w:eastAsia="Calibri" w:hAnsiTheme="majorHAnsi" w:cstheme="majorHAnsi"/>
+                <w:lang w:val="pt-BR"/>
+              </w:rPr>
+              <w:t>no momento atual</w:t>
+            </w:r>
+            <w:proofErr w:type="gramEnd"/>
+            <w:r>
+              <w:rPr>
+                <w:rFonts w:asciiTheme="majorHAnsi" w:eastAsia="Calibri" w:hAnsiTheme="majorHAnsi" w:cstheme="majorHAnsi"/>
+                <w:lang w:val="pt-BR"/>
+              </w:rPr>
+              <w:t>.</w:t>
             </w:r>
           </w:p>
         </w:tc>
@@ -2860,14 +2892,29 @@
                 <w:rFonts w:ascii="Calibri" w:eastAsia="Calibri" w:hAnsi="Calibri" w:cs="Calibri"/>
                 <w:lang w:val="en-US"/>
               </w:rPr>
-              <w:t>_patologies</w:t>
+              <w:t>_</w:t>
+            </w:r>
+            <w:proofErr w:type="gramStart"/>
+            <w:r>
+              <w:rPr>
+                <w:rFonts w:ascii="Calibri" w:eastAsia="Calibri" w:hAnsi="Calibri" w:cs="Calibri"/>
+                <w:lang w:val="en-US"/>
+              </w:rPr>
+              <w:t>patologies</w:t>
             </w:r>
             <w:proofErr w:type="spellEnd"/>
             <w:r>
               <w:rPr>
                 <w:rFonts w:ascii="Calibri" w:eastAsia="Calibri" w:hAnsi="Calibri" w:cs="Calibri"/>
               </w:rPr>
-              <w:t>.items()%}</w:t>
+              <w:t>.items()%</w:t>
+            </w:r>
+            <w:proofErr w:type="gramEnd"/>
+            <w:r>
+              <w:rPr>
+                <w:rFonts w:ascii="Calibri" w:eastAsia="Calibri" w:hAnsi="Calibri" w:cs="Calibri"/>
+              </w:rPr>
+              <w:t>}</w:t>
             </w:r>
           </w:p>
         </w:tc>
@@ -3123,6 +3170,7 @@
               <w:t>{{</w:t>
             </w:r>
             <w:proofErr w:type="spellStart"/>
+            <w:proofErr w:type="gramStart"/>
             <w:r>
               <w:rPr>
                 <w:rFonts w:ascii="Calibri" w:eastAsia="Calibri" w:hAnsi="Calibri" w:cs="Calibri"/>
@@ -3132,6 +3180,7 @@
               <w:t>item.nome</w:t>
             </w:r>
             <w:proofErr w:type="spellEnd"/>
+            <w:proofErr w:type="gramEnd"/>
             <w:r>
               <w:rPr>
                 <w:rFonts w:ascii="Calibri" w:eastAsia="Calibri" w:hAnsi="Calibri" w:cs="Calibri"/>
@@ -3153,6 +3202,7 @@
               <w:t>{{</w:t>
             </w:r>
             <w:proofErr w:type="spellStart"/>
+            <w:proofErr w:type="gramStart"/>
             <w:r>
               <w:rPr>
                 <w:rFonts w:ascii="Calibri" w:eastAsia="Calibri" w:hAnsi="Calibri" w:cs="Calibri"/>
@@ -3160,6 +3210,7 @@
               <w:t>item.tipo</w:t>
             </w:r>
             <w:proofErr w:type="spellEnd"/>
+            <w:proofErr w:type="gramEnd"/>
             <w:r>
               <w:rPr>
                 <w:rFonts w:ascii="Calibri" w:eastAsia="Calibri" w:hAnsi="Calibri" w:cs="Calibri"/>
@@ -3191,6 +3242,7 @@
               <w:t>{{</w:t>
             </w:r>
             <w:proofErr w:type="spellStart"/>
+            <w:proofErr w:type="gramStart"/>
             <w:r>
               <w:rPr>
                 <w:rFonts w:ascii="Calibri" w:eastAsia="Calibri" w:hAnsi="Calibri" w:cs="Calibri"/>
@@ -3198,6 +3250,7 @@
               <w:t>item.sintomas</w:t>
             </w:r>
             <w:proofErr w:type="spellEnd"/>
+            <w:proofErr w:type="gramEnd"/>
             <w:r>
               <w:rPr>
                 <w:rFonts w:ascii="Calibri" w:eastAsia="Calibri" w:hAnsi="Calibri" w:cs="Calibri"/>
@@ -3225,6 +3278,7 @@
               <w:t>{{</w:t>
             </w:r>
             <w:proofErr w:type="spellStart"/>
+            <w:proofErr w:type="gramStart"/>
             <w:r>
               <w:rPr>
                 <w:rFonts w:ascii="Calibri" w:eastAsia="Calibri" w:hAnsi="Calibri" w:cs="Calibri"/>
@@ -3232,6 +3286,7 @@
               <w:t>item.D</w:t>
             </w:r>
             <w:proofErr w:type="spellEnd"/>
+            <w:proofErr w:type="gramEnd"/>
             <w:r>
               <w:rPr>
                 <w:rFonts w:ascii="Calibri" w:eastAsia="Calibri" w:hAnsi="Calibri" w:cs="Calibri"/>
@@ -3293,6 +3348,286 @@
         </w:rPr>
       </w:pPr>
     </w:p>
+    <w:tbl>
+      <w:tblPr>
+        <w:tblW w:w="10915" w:type="dxa"/>
+        <w:tblInd w:w="-5" w:type="dxa"/>
+        <w:tblBorders>
+          <w:top w:val="single" w:sz="4" w:space="0" w:color="000000"/>
+          <w:left w:val="single" w:sz="4" w:space="0" w:color="000000"/>
+          <w:bottom w:val="single" w:sz="4" w:space="0" w:color="000000"/>
+          <w:right w:val="single" w:sz="4" w:space="0" w:color="000000"/>
+          <w:insideH w:val="single" w:sz="4" w:space="0" w:color="000000"/>
+          <w:insideV w:val="single" w:sz="4" w:space="0" w:color="000000"/>
+        </w:tblBorders>
+        <w:tblLayout w:type="fixed"/>
+        <w:tblLook w:val="0400" w:firstRow="0" w:lastRow="0" w:firstColumn="0" w:lastColumn="0" w:noHBand="0" w:noVBand="1"/>
+      </w:tblPr>
+      <w:tblGrid>
+        <w:gridCol w:w="5387"/>
+        <w:gridCol w:w="5528"/>
+      </w:tblGrid>
+      <w:tr>
+        <w:trPr>
+          <w:trHeight w:val="279"/>
+          <w:tblHeader/>
+        </w:trPr>
+        <w:tc>
+          <w:tcPr>
+            <w:tcW w:w="10915" w:type="dxa"/>
+            <w:gridSpan w:val="2"/>
+            <w:shd w:val="clear" w:color="auto" w:fill="D9D9D9"/>
+          </w:tcPr>
+          <w:p>
+            <w:pPr>
+              <w:spacing w:after="0" w:line="240" w:lineRule="auto"/>
+              <w:jc w:val="center"/>
+              <w:rPr>
+                <w:rFonts w:ascii="Calibri" w:eastAsia="Calibri" w:hAnsi="Calibri" w:cs="Calibri"/>
+                <w:b/>
+                <w:bCs/>
+                <w:lang w:val="pt-BR"/>
+              </w:rPr>
+            </w:pPr>
+            <w:r>
+              <w:rPr>
+                <w:rFonts w:ascii="Calibri" w:eastAsia="Calibri" w:hAnsi="Calibri" w:cs="Calibri"/>
+                <w:b/>
+                <w:bCs/>
+                <w:lang w:val="pt-BR"/>
+              </w:rPr>
+              <w:t>PERGUNTAS E RESPOSTAS ANAMNESE</w:t>
+            </w:r>
+          </w:p>
+        </w:tc>
+      </w:tr>
+      <w:tr>
+        <w:trPr>
+          <w:trHeight w:val="279"/>
+          <w:tblHeader/>
+        </w:trPr>
+        <w:tc>
+          <w:tcPr>
+            <w:tcW w:w="5387" w:type="dxa"/>
+            <w:shd w:val="clear" w:color="auto" w:fill="D9D9D9"/>
+          </w:tcPr>
+          <w:p>
+            <w:pPr>
+              <w:spacing w:after="0" w:line="240" w:lineRule="auto"/>
+              <w:jc w:val="center"/>
+              <w:rPr>
+                <w:rFonts w:ascii="Calibri" w:eastAsia="Calibri" w:hAnsi="Calibri" w:cs="Calibri"/>
+                <w:b/>
+                <w:bCs/>
+                <w:lang w:val="pt-BR"/>
+              </w:rPr>
+            </w:pPr>
+            <w:r>
+              <w:rPr>
+                <w:rFonts w:ascii="Calibri" w:eastAsia="Calibri" w:hAnsi="Calibri" w:cs="Calibri"/>
+                <w:b/>
+                <w:bCs/>
+                <w:lang w:val="pt-BR"/>
+              </w:rPr>
+              <w:t>PERGUNTA</w:t>
+            </w:r>
+          </w:p>
+        </w:tc>
+        <w:tc>
+          <w:tcPr>
+            <w:tcW w:w="5528" w:type="dxa"/>
+            <w:shd w:val="clear" w:color="auto" w:fill="D9D9D9"/>
+          </w:tcPr>
+          <w:p>
+            <w:pPr>
+              <w:spacing w:after="0" w:line="240" w:lineRule="auto"/>
+              <w:jc w:val="center"/>
+              <w:rPr>
+                <w:rFonts w:ascii="Calibri" w:eastAsia="Calibri" w:hAnsi="Calibri" w:cs="Calibri"/>
+                <w:b/>
+                <w:bCs/>
+                <w:lang w:val="pt-BR"/>
+              </w:rPr>
+            </w:pPr>
+            <w:r>
+              <w:rPr>
+                <w:rFonts w:ascii="Calibri" w:eastAsia="Calibri" w:hAnsi="Calibri" w:cs="Calibri"/>
+                <w:b/>
+                <w:bCs/>
+                <w:lang w:val="pt-BR"/>
+              </w:rPr>
+              <w:t>RESPOSTA</w:t>
+            </w:r>
+          </w:p>
+        </w:tc>
+      </w:tr>
+      <w:tr>
+        <w:trPr>
+          <w:trHeight w:val="279"/>
+        </w:trPr>
+        <w:tc>
+          <w:tcPr>
+            <w:tcW w:w="10915" w:type="dxa"/>
+            <w:gridSpan w:val="2"/>
+          </w:tcPr>
+          <w:p>
+            <w:pPr>
+              <w:spacing w:after="0" w:line="240" w:lineRule="auto"/>
+              <w:jc w:val="center"/>
+              <w:rPr>
+                <w:rFonts w:ascii="Calibri" w:eastAsia="Calibri" w:hAnsi="Calibri" w:cs="Calibri"/>
+              </w:rPr>
+            </w:pPr>
+            <w:r>
+              <w:rPr>
+                <w:rFonts w:ascii="Calibri" w:eastAsia="Calibri" w:hAnsi="Calibri" w:cs="Calibri"/>
+              </w:rPr>
+              <w:t xml:space="preserve">{%tr for item in </w:t>
+            </w:r>
+            <w:r>
+              <w:rPr>
+                <w:rFonts w:ascii="Calibri" w:eastAsia="Calibri" w:hAnsi="Calibri" w:cs="Calibri"/>
+              </w:rPr>
+              <w:t>anamnesis</w:t>
+            </w:r>
+            <w:r>
+              <w:rPr>
+                <w:rFonts w:ascii="Calibri" w:eastAsia="Calibri" w:hAnsi="Calibri" w:cs="Calibri"/>
+              </w:rPr>
+              <w:t xml:space="preserve"> </w:t>
+            </w:r>
+            <w:r>
+              <w:rPr>
+                <w:rFonts w:ascii="Calibri" w:eastAsia="Calibri" w:hAnsi="Calibri" w:cs="Calibri"/>
+              </w:rPr>
+              <w:t>%}</w:t>
+            </w:r>
+          </w:p>
+        </w:tc>
+      </w:tr>
+      <w:tr>
+        <w:trPr>
+          <w:trHeight w:val="279"/>
+        </w:trPr>
+        <w:tc>
+          <w:tcPr>
+            <w:tcW w:w="5387" w:type="dxa"/>
+          </w:tcPr>
+          <w:p>
+            <w:pPr>
+              <w:spacing w:after="0" w:line="240" w:lineRule="auto"/>
+              <w:rPr>
+                <w:rFonts w:ascii="Calibri" w:eastAsia="Calibri" w:hAnsi="Calibri" w:cs="Calibri"/>
+              </w:rPr>
+            </w:pPr>
+            <w:r>
+              <w:rPr>
+                <w:rFonts w:ascii="Calibri" w:eastAsia="Calibri" w:hAnsi="Calibri" w:cs="Calibri"/>
+              </w:rPr>
+              <w:t>{{</w:t>
+            </w:r>
+            <w:proofErr w:type="spellStart"/>
+            <w:proofErr w:type="gramStart"/>
+            <w:r>
+              <w:rPr>
+                <w:rFonts w:ascii="Calibri" w:eastAsia="Calibri" w:hAnsi="Calibri" w:cs="Calibri"/>
+              </w:rPr>
+              <w:t>item.pergunta</w:t>
+            </w:r>
+            <w:proofErr w:type="spellEnd"/>
+            <w:proofErr w:type="gramEnd"/>
+            <w:r>
+              <w:rPr>
+                <w:rFonts w:ascii="Calibri" w:eastAsia="Calibri" w:hAnsi="Calibri" w:cs="Calibri"/>
+              </w:rPr>
+              <w:t>}}</w:t>
+            </w:r>
+          </w:p>
+        </w:tc>
+        <w:tc>
+          <w:tcPr>
+            <w:tcW w:w="5528" w:type="dxa"/>
+          </w:tcPr>
+          <w:p>
+            <w:pPr>
+              <w:spacing w:after="0" w:line="240" w:lineRule="auto"/>
+              <w:jc w:val="center"/>
+              <w:rPr>
+                <w:rFonts w:ascii="Calibri" w:eastAsia="Calibri" w:hAnsi="Calibri" w:cs="Calibri"/>
+              </w:rPr>
+            </w:pPr>
+            <w:r>
+              <w:rPr>
+                <w:rFonts w:ascii="Calibri" w:eastAsia="Calibri" w:hAnsi="Calibri" w:cs="Calibri"/>
+              </w:rPr>
+              <w:t>{{</w:t>
+            </w:r>
+            <w:proofErr w:type="spellStart"/>
+            <w:proofErr w:type="gramStart"/>
+            <w:r>
+              <w:rPr>
+                <w:rFonts w:ascii="Calibri" w:eastAsia="Calibri" w:hAnsi="Calibri" w:cs="Calibri"/>
+              </w:rPr>
+              <w:t>item</w:t>
+            </w:r>
+            <w:r>
+              <w:rPr>
+                <w:rFonts w:ascii="Calibri" w:eastAsia="Calibri" w:hAnsi="Calibri" w:cs="Calibri"/>
+              </w:rPr>
+              <w:t>.resposta</w:t>
+            </w:r>
+            <w:proofErr w:type="spellEnd"/>
+            <w:proofErr w:type="gramEnd"/>
+            <w:r>
+              <w:rPr>
+                <w:rFonts w:ascii="Calibri" w:eastAsia="Calibri" w:hAnsi="Calibri" w:cs="Calibri"/>
+              </w:rPr>
+              <w:t>}}</w:t>
+            </w:r>
+          </w:p>
+        </w:tc>
+      </w:tr>
+      <w:tr>
+        <w:trPr>
+          <w:trHeight w:val="279"/>
+        </w:trPr>
+        <w:tc>
+          <w:tcPr>
+            <w:tcW w:w="10915" w:type="dxa"/>
+            <w:gridSpan w:val="2"/>
+          </w:tcPr>
+          <w:p>
+            <w:pPr>
+              <w:spacing w:after="0" w:line="240" w:lineRule="auto"/>
+              <w:jc w:val="center"/>
+              <w:rPr>
+                <w:rFonts w:ascii="Calibri" w:eastAsia="Calibri" w:hAnsi="Calibri" w:cs="Calibri"/>
+              </w:rPr>
+            </w:pPr>
+            <w:r>
+              <w:rPr>
+                <w:rFonts w:ascii="Calibri" w:eastAsia="Calibri" w:hAnsi="Calibri" w:cs="Calibri"/>
+              </w:rPr>
+              <w:t xml:space="preserve">{%tr </w:t>
+            </w:r>
+            <w:proofErr w:type="spellStart"/>
+            <w:r>
+              <w:rPr>
+                <w:rFonts w:ascii="Calibri" w:eastAsia="Calibri" w:hAnsi="Calibri" w:cs="Calibri"/>
+              </w:rPr>
+              <w:t>endfor</w:t>
+            </w:r>
+            <w:proofErr w:type="spellEnd"/>
+            <w:r>
+              <w:rPr>
+                <w:rFonts w:ascii="Calibri" w:eastAsia="Calibri" w:hAnsi="Calibri" w:cs="Calibri"/>
+              </w:rPr>
+              <w:t xml:space="preserve"> %}</w:t>
+            </w:r>
+          </w:p>
+        </w:tc>
+      </w:tr>
+    </w:tbl>
     <w:p>
       <w:pPr>
         <w:widowControl w:val="0"/>
@@ -3460,6 +3795,7 @@
               <w:t>{{</w:t>
             </w:r>
             <w:proofErr w:type="spellStart"/>
+            <w:proofErr w:type="gramStart"/>
             <w:r>
               <w:rPr>
                 <w:rFonts w:ascii="Calibri" w:eastAsia="Calibri" w:hAnsi="Calibri" w:cs="Calibri"/>
@@ -3469,6 +3805,7 @@
               <w:t>item.nome</w:t>
             </w:r>
             <w:proofErr w:type="spellEnd"/>
+            <w:proofErr w:type="gramEnd"/>
             <w:r>
               <w:rPr>
                 <w:rFonts w:ascii="Calibri" w:eastAsia="Calibri" w:hAnsi="Calibri" w:cs="Calibri"/>
@@ -3484,6 +3821,7 @@
               <w:t xml:space="preserve"> – {{</w:t>
             </w:r>
             <w:proofErr w:type="spellStart"/>
+            <w:proofErr w:type="gramStart"/>
             <w:r>
               <w:rPr>
                 <w:rFonts w:ascii="Calibri" w:eastAsia="Calibri" w:hAnsi="Calibri" w:cs="Calibri"/>
@@ -3491,6 +3829,7 @@
               <w:t>item.tipo</w:t>
             </w:r>
             <w:proofErr w:type="spellEnd"/>
+            <w:proofErr w:type="gramEnd"/>
             <w:r>
               <w:rPr>
                 <w:rFonts w:ascii="Calibri" w:eastAsia="Calibri" w:hAnsi="Calibri" w:cs="Calibri"/>
@@ -3510,6 +3849,7 @@
               <w:t xml:space="preserve"> {{</w:t>
             </w:r>
             <w:proofErr w:type="spellStart"/>
+            <w:proofErr w:type="gramStart"/>
             <w:r>
               <w:rPr>
                 <w:rFonts w:ascii="Calibri" w:eastAsia="Calibri" w:hAnsi="Calibri" w:cs="Calibri"/>
@@ -3517,6 +3857,7 @@
               <w:t>item.sintomas</w:t>
             </w:r>
             <w:proofErr w:type="spellEnd"/>
+            <w:proofErr w:type="gramEnd"/>
             <w:r>
               <w:rPr>
                 <w:rFonts w:ascii="Calibri" w:eastAsia="Calibri" w:hAnsi="Calibri" w:cs="Calibri"/>
@@ -3544,6 +3885,7 @@
               <w:t>{{</w:t>
             </w:r>
             <w:proofErr w:type="spellStart"/>
+            <w:proofErr w:type="gramStart"/>
             <w:r>
               <w:rPr>
                 <w:rFonts w:ascii="Calibri" w:eastAsia="Calibri" w:hAnsi="Calibri" w:cs="Calibri"/>
@@ -3551,6 +3893,7 @@
               <w:t>item.D</w:t>
             </w:r>
             <w:proofErr w:type="spellEnd"/>
+            <w:proofErr w:type="gramEnd"/>
             <w:r>
               <w:rPr>
                 <w:rFonts w:ascii="Calibri" w:eastAsia="Calibri" w:hAnsi="Calibri" w:cs="Calibri"/>
@@ -3760,6 +4103,7 @@
               <w:t>{{</w:t>
             </w:r>
             <w:proofErr w:type="spellStart"/>
+            <w:proofErr w:type="gramStart"/>
             <w:r>
               <w:rPr>
                 <w:rFonts w:ascii="Calibri" w:eastAsia="Calibri" w:hAnsi="Calibri" w:cs="Calibri"/>
@@ -3769,6 +4113,7 @@
               <w:t>item.nome</w:t>
             </w:r>
             <w:proofErr w:type="spellEnd"/>
+            <w:proofErr w:type="gramEnd"/>
             <w:r>
               <w:rPr>
                 <w:rFonts w:ascii="Calibri" w:eastAsia="Calibri" w:hAnsi="Calibri" w:cs="Calibri"/>
@@ -3806,6 +4151,7 @@
               <w:t>{{</w:t>
             </w:r>
             <w:proofErr w:type="spellStart"/>
+            <w:proofErr w:type="gramStart"/>
             <w:r>
               <w:rPr>
                 <w:rFonts w:ascii="Calibri" w:eastAsia="Calibri" w:hAnsi="Calibri" w:cs="Calibri"/>
@@ -3813,6 +4159,7 @@
               <w:t>item.efeitos</w:t>
             </w:r>
             <w:proofErr w:type="spellEnd"/>
+            <w:proofErr w:type="gramEnd"/>
             <w:r>
               <w:rPr>
                 <w:rFonts w:ascii="Calibri" w:eastAsia="Calibri" w:hAnsi="Calibri" w:cs="Calibri"/>
@@ -3840,6 +4187,7 @@
               <w:t>{{</w:t>
             </w:r>
             <w:proofErr w:type="spellStart"/>
+            <w:proofErr w:type="gramStart"/>
             <w:r>
               <w:rPr>
                 <w:rFonts w:ascii="Calibri" w:eastAsia="Calibri" w:hAnsi="Calibri" w:cs="Calibri"/>
@@ -3847,6 +4195,7 @@
               <w:t>item.D</w:t>
             </w:r>
             <w:proofErr w:type="spellEnd"/>
+            <w:proofErr w:type="gramEnd"/>
             <w:r>
               <w:rPr>
                 <w:rFonts w:ascii="Calibri" w:eastAsia="Calibri" w:hAnsi="Calibri" w:cs="Calibri"/>
@@ -4125,13 +4474,23 @@
                 <w:bCs/>
               </w:rPr>
             </w:pPr>
+            <w:proofErr w:type="gramStart"/>
             <w:r>
               <w:rPr>
                 <w:rFonts w:ascii="Calibri" w:eastAsia="Calibri" w:hAnsi="Calibri" w:cs="Calibri"/>
                 <w:b/>
                 <w:bCs/>
               </w:rPr>
-              <w:t>A EVITAR</w:t>
+              <w:t>A</w:t>
+            </w:r>
+            <w:proofErr w:type="gramEnd"/>
+            <w:r>
+              <w:rPr>
+                <w:rFonts w:ascii="Calibri" w:eastAsia="Calibri" w:hAnsi="Calibri" w:cs="Calibri"/>
+                <w:b/>
+                <w:bCs/>
+              </w:rPr>
+              <w:t xml:space="preserve"> EVITAR</w:t>
             </w:r>
           </w:p>
         </w:tc>
@@ -4261,6 +4620,7 @@
               </w:rPr>
               <w:t>{{</w:t>
             </w:r>
+            <w:proofErr w:type="gramStart"/>
             <w:r>
               <w:rPr>
                 <w:rFonts w:ascii="Calibri" w:eastAsia="Calibri" w:hAnsi="Calibri" w:cs="Calibri"/>
@@ -4271,7 +4631,14 @@
               <w:rPr>
                 <w:rFonts w:ascii="Calibri" w:eastAsia="Calibri" w:hAnsi="Calibri" w:cs="Calibri"/>
               </w:rPr>
-              <w:t>[0]</w:t>
+              <w:t>[</w:t>
+            </w:r>
+            <w:proofErr w:type="gramEnd"/>
+            <w:r>
+              <w:rPr>
+                <w:rFonts w:ascii="Calibri" w:eastAsia="Calibri" w:hAnsi="Calibri" w:cs="Calibri"/>
+              </w:rPr>
+              <w:t>0]</w:t>
             </w:r>
             <w:r>
               <w:rPr>
@@ -4299,6 +4666,7 @@
                 <w:rFonts w:ascii="Calibri" w:eastAsia="Calibri" w:hAnsi="Calibri" w:cs="Calibri"/>
               </w:rPr>
             </w:pPr>
+            <w:proofErr w:type="gramStart"/>
             <w:r>
               <w:rPr>
                 <w:rFonts w:ascii="Calibri" w:eastAsia="Calibri" w:hAnsi="Calibri" w:cs="Calibri"/>
@@ -4309,7 +4677,14 @@
               <w:rPr>
                 <w:rFonts w:ascii="Calibri" w:eastAsia="Calibri" w:hAnsi="Calibri" w:cs="Calibri"/>
               </w:rPr>
-              <w:t xml:space="preserve"> row[1]</w:t>
+              <w:t xml:space="preserve"> row</w:t>
+            </w:r>
+            <w:proofErr w:type="gramEnd"/>
+            <w:r>
+              <w:rPr>
+                <w:rFonts w:ascii="Calibri" w:eastAsia="Calibri" w:hAnsi="Calibri" w:cs="Calibri"/>
+              </w:rPr>
+              <w:t>[1]</w:t>
             </w:r>
             <w:r>
               <w:rPr>
@@ -4343,11 +4718,19 @@
               </w:rPr>
               <w:t>{{</w:t>
             </w:r>
-            <w:r>
-              <w:rPr>
-                <w:rFonts w:ascii="Calibri" w:eastAsia="Calibri" w:hAnsi="Calibri" w:cs="Calibri"/>
-              </w:rPr>
-              <w:t>row[2]</w:t>
+            <w:proofErr w:type="gramStart"/>
+            <w:r>
+              <w:rPr>
+                <w:rFonts w:ascii="Calibri" w:eastAsia="Calibri" w:hAnsi="Calibri" w:cs="Calibri"/>
+              </w:rPr>
+              <w:t>row[</w:t>
+            </w:r>
+            <w:proofErr w:type="gramEnd"/>
+            <w:r>
+              <w:rPr>
+                <w:rFonts w:ascii="Calibri" w:eastAsia="Calibri" w:hAnsi="Calibri" w:cs="Calibri"/>
+              </w:rPr>
+              <w:t>2]</w:t>
             </w:r>
             <w:r>
               <w:rPr>
@@ -4375,6 +4758,7 @@
                 <w:rFonts w:ascii="Calibri" w:eastAsia="Calibri" w:hAnsi="Calibri" w:cs="Calibri"/>
               </w:rPr>
             </w:pPr>
+            <w:proofErr w:type="gramStart"/>
             <w:r>
               <w:rPr>
                 <w:rFonts w:ascii="Calibri" w:eastAsia="Calibri" w:hAnsi="Calibri" w:cs="Calibri"/>
@@ -4385,7 +4769,14 @@
               <w:rPr>
                 <w:rFonts w:ascii="Calibri" w:eastAsia="Calibri" w:hAnsi="Calibri" w:cs="Calibri"/>
               </w:rPr>
-              <w:t xml:space="preserve"> row[3]</w:t>
+              <w:t xml:space="preserve"> row</w:t>
+            </w:r>
+            <w:proofErr w:type="gramEnd"/>
+            <w:r>
+              <w:rPr>
+                <w:rFonts w:ascii="Calibri" w:eastAsia="Calibri" w:hAnsi="Calibri" w:cs="Calibri"/>
+              </w:rPr>
+              <w:t>[3]</w:t>
             </w:r>
             <w:r>
               <w:rPr>
@@ -4413,6 +4804,7 @@
                 <w:rFonts w:ascii="Calibri" w:eastAsia="Calibri" w:hAnsi="Calibri" w:cs="Calibri"/>
               </w:rPr>
             </w:pPr>
+            <w:proofErr w:type="gramStart"/>
             <w:r>
               <w:rPr>
                 <w:rFonts w:ascii="Calibri" w:eastAsia="Calibri" w:hAnsi="Calibri" w:cs="Calibri"/>
@@ -4423,7 +4815,14 @@
               <w:rPr>
                 <w:rFonts w:ascii="Calibri" w:eastAsia="Calibri" w:hAnsi="Calibri" w:cs="Calibri"/>
               </w:rPr>
-              <w:t xml:space="preserve"> row[4]</w:t>
+              <w:t xml:space="preserve"> row</w:t>
+            </w:r>
+            <w:proofErr w:type="gramEnd"/>
+            <w:r>
+              <w:rPr>
+                <w:rFonts w:ascii="Calibri" w:eastAsia="Calibri" w:hAnsi="Calibri" w:cs="Calibri"/>
+              </w:rPr>
+              <w:t>[4]</w:t>
             </w:r>
             <w:r>
               <w:rPr>
@@ -4451,6 +4850,7 @@
                 <w:rFonts w:ascii="Calibri" w:eastAsia="Calibri" w:hAnsi="Calibri" w:cs="Calibri"/>
               </w:rPr>
             </w:pPr>
+            <w:proofErr w:type="gramStart"/>
             <w:r>
               <w:rPr>
                 <w:rFonts w:ascii="Calibri" w:eastAsia="Calibri" w:hAnsi="Calibri" w:cs="Calibri"/>
@@ -4461,7 +4861,14 @@
               <w:rPr>
                 <w:rFonts w:ascii="Calibri" w:eastAsia="Calibri" w:hAnsi="Calibri" w:cs="Calibri"/>
               </w:rPr>
-              <w:t xml:space="preserve"> row[5]</w:t>
+              <w:t xml:space="preserve"> row</w:t>
+            </w:r>
+            <w:proofErr w:type="gramEnd"/>
+            <w:r>
+              <w:rPr>
+                <w:rFonts w:ascii="Calibri" w:eastAsia="Calibri" w:hAnsi="Calibri" w:cs="Calibri"/>
+              </w:rPr>
+              <w:t>[5]</w:t>
             </w:r>
             <w:r>
               <w:rPr>
@@ -4760,14 +5167,28 @@
               <w:rPr>
                 <w:rFonts w:ascii="Calibri" w:eastAsia="Calibri" w:hAnsi="Calibri" w:cs="Calibri"/>
               </w:rPr>
-              <w:t>table_emotions.items</w:t>
+              <w:t>table_</w:t>
+            </w:r>
+            <w:proofErr w:type="gramStart"/>
+            <w:r>
+              <w:rPr>
+                <w:rFonts w:ascii="Calibri" w:eastAsia="Calibri" w:hAnsi="Calibri" w:cs="Calibri"/>
+              </w:rPr>
+              <w:t>emotions.items</w:t>
             </w:r>
             <w:proofErr w:type="spellEnd"/>
             <w:r>
               <w:rPr>
                 <w:rFonts w:ascii="Calibri" w:eastAsia="Calibri" w:hAnsi="Calibri" w:cs="Calibri"/>
               </w:rPr>
-              <w:t>()%}</w:t>
+              <w:t>()%</w:t>
+            </w:r>
+            <w:proofErr w:type="gramEnd"/>
+            <w:r>
+              <w:rPr>
+                <w:rFonts w:ascii="Calibri" w:eastAsia="Calibri" w:hAnsi="Calibri" w:cs="Calibri"/>
+              </w:rPr>
+              <w:t>}</w:t>
             </w:r>
           </w:p>
         </w:tc>
@@ -5091,6 +5512,7 @@
               <w:t>{{</w:t>
             </w:r>
             <w:proofErr w:type="spellStart"/>
+            <w:proofErr w:type="gramStart"/>
             <w:r>
               <w:rPr>
                 <w:rFonts w:ascii="Calibri" w:eastAsia="Calibri" w:hAnsi="Calibri" w:cs="Calibri"/>
@@ -5098,6 +5520,7 @@
               <w:t>item.cristal</w:t>
             </w:r>
             <w:proofErr w:type="spellEnd"/>
+            <w:proofErr w:type="gramEnd"/>
             <w:r>
               <w:rPr>
                 <w:rFonts w:ascii="Calibri" w:eastAsia="Calibri" w:hAnsi="Calibri" w:cs="Calibri"/>
@@ -5131,12 +5554,21 @@
               <w:t>{{</w:t>
             </w:r>
             <w:proofErr w:type="spellStart"/>
+            <w:proofErr w:type="gramStart"/>
             <w:r>
               <w:rPr>
                 <w:rFonts w:ascii="Calibri" w:eastAsia="Calibri" w:hAnsi="Calibri" w:cs="Calibri"/>
                 <w:lang w:val="pt-BR"/>
               </w:rPr>
-              <w:t>item.beneficios_fisicos</w:t>
+              <w:t>item.beneficios</w:t>
+            </w:r>
+            <w:proofErr w:type="gramEnd"/>
+            <w:r>
+              <w:rPr>
+                <w:rFonts w:ascii="Calibri" w:eastAsia="Calibri" w:hAnsi="Calibri" w:cs="Calibri"/>
+                <w:lang w:val="pt-BR"/>
+              </w:rPr>
+              <w:t>_fisicos</w:t>
             </w:r>
             <w:proofErr w:type="spellEnd"/>
             <w:r>
@@ -5173,12 +5605,21 @@
               <w:t>{{</w:t>
             </w:r>
             <w:proofErr w:type="spellStart"/>
+            <w:proofErr w:type="gramStart"/>
             <w:r>
               <w:rPr>
                 <w:rFonts w:ascii="Calibri" w:eastAsia="Calibri" w:hAnsi="Calibri" w:cs="Calibri"/>
                 <w:lang w:val="pt-BR"/>
               </w:rPr>
-              <w:t>item.beneficios_emocionais</w:t>
+              <w:t>item.beneficios</w:t>
+            </w:r>
+            <w:proofErr w:type="gramEnd"/>
+            <w:r>
+              <w:rPr>
+                <w:rFonts w:ascii="Calibri" w:eastAsia="Calibri" w:hAnsi="Calibri" w:cs="Calibri"/>
+                <w:lang w:val="pt-BR"/>
+              </w:rPr>
+              <w:t>_emocionais</w:t>
             </w:r>
             <w:proofErr w:type="spellEnd"/>
             <w:r>
@@ -5214,6 +5655,7 @@
               <w:t>{{</w:t>
             </w:r>
             <w:proofErr w:type="spellStart"/>
+            <w:proofErr w:type="gramStart"/>
             <w:r>
               <w:rPr>
                 <w:rFonts w:ascii="Calibri" w:eastAsia="Calibri" w:hAnsi="Calibri" w:cs="Calibri"/>
@@ -5221,6 +5663,7 @@
               <w:t>item.D</w:t>
             </w:r>
             <w:proofErr w:type="spellEnd"/>
+            <w:proofErr w:type="gramEnd"/>
             <w:r>
               <w:rPr>
                 <w:rFonts w:ascii="Calibri" w:eastAsia="Calibri" w:hAnsi="Calibri" w:cs="Calibri"/>
@@ -5420,7 +5863,6 @@
           <w:rFonts w:ascii="Calibri" w:eastAsia="Calibri" w:hAnsi="Calibri" w:cs="Calibri"/>
           <w:lang w:val="pt-BR"/>
         </w:rPr>
-        <w:lastRenderedPageBreak/>
         <w:br/>
       </w:r>
       <w:proofErr w:type="spellStart"/>
@@ -6729,6 +7171,7 @@
   <w:style w:type="character" w:default="1" w:styleId="Fontepargpadro">
     <w:name w:val="Default Paragraph Font"/>
     <w:uiPriority w:val="1"/>
+    <w:semiHidden/>
     <w:unhideWhenUsed/>
   </w:style>
   <w:style w:type="table" w:default="1" w:styleId="Tabelanormal">
@@ -20043,28 +20486,28 @@
 </file>
 
 <file path=customXml/item1.xml><?xml version="1.0" encoding="utf-8"?>
-<b:Sources xmlns:b="http://schemas.openxmlformats.org/officeDocument/2006/bibliography" xmlns="http://schemas.openxmlformats.org/officeDocument/2006/bibliography" SelectedStyle="\APASixthEditionOfficeOnline.xsl" StyleName="APA" Version="6"/>
-</file>
-
-<file path=customXml/item2.xml><?xml version="1.0" encoding="utf-8"?>
 <go:gDocsCustomXmlDataStorage xmlns:go="http://customooxmlschemas.google.com/" xmlns:r="http://schemas.openxmlformats.org/officeDocument/2006/relationships" uri="GoogleDocsCustomDataVersion2">
   <go:docsCustomData xmlns:go="http://customooxmlschemas.google.com/" roundtripDataSignature="AMtx7miERh6qB16YFgczjzxyVSGtOW3B2w==">CgMxLjAyDmguMWMxb2N3Z3B1MzR3Mg5oLmF2eTVmMmJlM2UwbDgAciExSkJZOWw4YnlDYUdQMC1mdi1EZV9mdEFUSW9OQ1FiQnQ=</go:docsCustomData>
 </go:gDocsCustomXmlDataStorage>
 </file>
 
-<file path=customXml/itemProps1.xml><?xml version="1.0" encoding="utf-8"?>
-<ds:datastoreItem xmlns:ds="http://schemas.openxmlformats.org/officeDocument/2006/customXml" ds:itemID="{1DD36646-2C87-4901-8585-215AEA719133}">
-  <ds:schemaRefs>
-    <ds:schemaRef ds:uri="http://schemas.openxmlformats.org/officeDocument/2006/bibliography"/>
-  </ds:schemaRefs>
-</ds:datastoreItem>
+<file path=customXml/item2.xml><?xml version="1.0" encoding="utf-8"?>
+<b:Sources xmlns:b="http://schemas.openxmlformats.org/officeDocument/2006/bibliography" xmlns="http://schemas.openxmlformats.org/officeDocument/2006/bibliography" SelectedStyle="\APASixthEditionOfficeOnline.xsl" StyleName="APA" Version="6"/>
 </file>
 
-<file path=customXml/itemProps2.xml><?xml version="1.0" encoding="utf-8"?>
+<file path=customXml/itemProps1.xml><?xml version="1.0" encoding="utf-8"?>
 <ds:datastoreItem xmlns:ds="http://schemas.openxmlformats.org/officeDocument/2006/customXml" ds:itemID="{11111111-1234-1234-1234-123412341234}">
   <ds:schemaRefs>
     <ds:schemaRef ds:uri="http://customooxmlschemas.google.com/"/>
     <ds:schemaRef ds:uri="http://schemas.openxmlformats.org/officeDocument/2006/relationships"/>
   </ds:schemaRefs>
 </ds:datastoreItem>
+</file>
+
+<file path=customXml/itemProps2.xml><?xml version="1.0" encoding="utf-8"?>
+<ds:datastoreItem xmlns:ds="http://schemas.openxmlformats.org/officeDocument/2006/customXml" ds:itemID="{1DD36646-2C87-4901-8585-215AEA719133}">
+  <ds:schemaRefs>
+    <ds:schemaRef ds:uri="http://schemas.openxmlformats.org/officeDocument/2006/bibliography"/>
+  </ds:schemaRefs>
+</ds:datastoreItem>
 </file>
</xml_diff>